<commit_message>
docs(pass): intégrer AELY et aelygroup.com dans le pack B2B
Co-authored-by: Mame2204 <Mame2204@users.noreply.github.com>
</commit_message>
<xml_diff>
--- a/docs/commercial/loop-pass-b2b/word/00-PACK-COMPLET-LOOP-PASS.docx
+++ b/docs/commercial/loop-pass-b2b/word/00-PACK-COMPLET-LOOP-PASS.docx
@@ -12,6 +12,255 @@
         <w:pStyle w:val="Title"/>
       </w:pPr>
       <w:r>
+        <w:t>00 IDENTITE AELY ET PASS</w:t>
+      </w:r>
+    </w:p>
+    <w:p>
+      <w:pPr>
+        <w:pStyle w:val="Heading1"/>
+      </w:pPr>
+      <w:r>
+        <w:t>AELY &amp; THE LOOP Pass — Identité et liens</w:t>
+      </w:r>
+    </w:p>
+    <w:p>
+      <w:pPr>
+        <w:pStyle w:val="Heading2"/>
+      </w:pPr>
+      <w:r>
+        <w:t>AELY (groupe)</w:t>
+      </w:r>
+    </w:p>
+    <w:p>
+      <w:r>
+        <w:t>| Élément | Valeur |</w:t>
+      </w:r>
+    </w:p>
+    <w:p>
+      <w:r>
+        <w:t>|---------|--------|</w:t>
+      </w:r>
+    </w:p>
+    <w:p>
+      <w:r>
+        <w:t>| **Marque** | **AELY** |</w:t>
+      </w:r>
+    </w:p>
+    <w:p>
+      <w:r>
+        <w:t>| **Site** | https://aelygroup.com |</w:t>
+      </w:r>
+    </w:p>
+    <w:p>
+      <w:r>
+        <w:t>| **Positionnement** | Solutions numériques &amp; data · Conakry, Guinée |</w:t>
+      </w:r>
+    </w:p>
+    <w:p>
+      <w:r>
+        <w:t>| **Périmètre** | Data / IA, produits numériques, conseil, transformation digitale |</w:t>
+      </w:r>
+    </w:p>
+    <w:p>
+      <w:r>
+        <w:t>| **Contact groupe** | contact@aelygroup.com · WhatsApp (voir site) |</w:t>
+      </w:r>
+    </w:p>
+    <w:p>
+      <w:r>
+        <w:t>| **Siège indicatif** | Dixinn, Conakry |</w:t>
+      </w:r>
+    </w:p>
+    <w:p>
+      <w:r>
+        <w:t>AELY est la **house brand** : The Loop (guide), THE LOOP Pass (fidélisation B2B), et autres projets peuvent s’y rattacher commercialement.</w:t>
+      </w:r>
+    </w:p>
+    <w:p>
+      <w:pPr>
+        <w:pStyle w:val="Heading2"/>
+      </w:pPr>
+      <w:r>
+        <w:t>THE LOOP Pass (produit B2B)</w:t>
+      </w:r>
+    </w:p>
+    <w:p>
+      <w:r>
+        <w:t>| Élément | Valeur |</w:t>
+      </w:r>
+    </w:p>
+    <w:p>
+      <w:r>
+        <w:t>|---------|--------|</w:t>
+      </w:r>
+    </w:p>
+    <w:p>
+      <w:r>
+        <w:t>| **Nom produit** | **THE LOOP Pass** |</w:t>
+      </w:r>
+    </w:p>
+    <w:p>
+      <w:r>
+        <w:t>| **Site produit** | https://pass.theloop-app.com |</w:t>
+      </w:r>
+    </w:p>
+    <w:p>
+      <w:r>
+        <w:t>| **Contact commercial Pass** | WhatsApp +224 626 68 06 06 · contact@theloop-app.com |</w:t>
+      </w:r>
+    </w:p>
+    <w:p>
+      <w:r>
+        <w:t>| **Technologie** | Plateforme white-label Boomerangme (exploitation par AELY) |</w:t>
+      </w:r>
+    </w:p>
+    <w:p>
+      <w:r>
+        <w:t>**Pitch court :** *« THE LOOP Pass, par AELY — fidélisation digitale pour commerces à Conakry. »*</w:t>
+      </w:r>
+    </w:p>
+    <w:p>
+      <w:pPr>
+        <w:pStyle w:val="Heading2"/>
+      </w:pPr>
+      <w:r>
+        <w:t>Immatriculation formelle (RCCM)</w:t>
+      </w:r>
+    </w:p>
+    <w:p>
+      <w:r>
+        <w:t>Vous prévoyez une **formalisation / immatriculation société en janvier 2027** (RCCM, NIF, factures au nom légal).</w:t>
+      </w:r>
+    </w:p>
+    <w:p>
+      <w:r>
+        <w:t xml:space="preserve">- **aelygroup.com** et la marque **AELY** renforcent la **crédibilité** dès décembre 2026.  </w:t>
+      </w:r>
+    </w:p>
+    <w:p>
+      <w:r>
+        <w:t xml:space="preserve">- Les **contrats décembre** peuvent nommer **AELY** et renvoyer à **aelygroup.com**, avec mention *« immatriculation RCCM en cours de finalisation »* si les numéros ne sont pas encore disponibles.  </w:t>
+      </w:r>
+    </w:p>
+    <w:p>
+      <w:r>
+        <w:t>- **Janvier 2027 :** factures avec RCCM/NIF + avenant (doc 11) si le signataire était une personne physique.</w:t>
+      </w:r>
+    </w:p>
+    <w:p>
+      <w:pPr>
+        <w:pStyle w:val="Heading2"/>
+      </w:pPr>
+      <w:r>
+        <w:t>Carte de visite (recommandation)</w:t>
+      </w:r>
+    </w:p>
+    <w:p>
+      <w:r>
+        <w:t>AELY</w:t>
+      </w:r>
+    </w:p>
+    <w:p>
+      <w:r>
+        <w:t>Solutions numériques · Conakry</w:t>
+      </w:r>
+    </w:p>
+    <w:p>
+      <w:r>
+        <w:t>aelygroup.com</w:t>
+      </w:r>
+    </w:p>
+    <w:p>
+      <w:r>
+        <w:t>[Prénom Nom] · [Fonction]</w:t>
+      </w:r>
+    </w:p>
+    <w:p>
+      <w:r>
+        <w:t>THE LOOP Pass — Fidélité commerçants</w:t>
+      </w:r>
+    </w:p>
+    <w:p>
+      <w:r>
+        <w:t>pass.theloop-app.com · +224 626 68 06 06</w:t>
+      </w:r>
+    </w:p>
+    <w:p>
+      <w:r>
+        <w:t>Ne imprimer **RCCM / NIF** sur la carte que lorsqu’ils sont **officiellement** attribués.</w:t>
+      </w:r>
+    </w:p>
+    <w:p>
+      <w:pPr>
+        <w:pStyle w:val="Heading2"/>
+      </w:pPr>
+      <w:r>
+        <w:t>Confiance commerçant (décembre)</w:t>
+      </w:r>
+    </w:p>
+    <w:p>
+      <w:r>
+        <w:t>Ordre de preuve en RDV :</w:t>
+      </w:r>
+    </w:p>
+    <w:p>
+      <w:r>
+        <w:t xml:space="preserve">1. **Démo live** sur leur téléphone  </w:t>
+      </w:r>
+    </w:p>
+    <w:p>
+      <w:r>
+        <w:t xml:space="preserve">2. **pass.theloop-app.com**  </w:t>
+      </w:r>
+    </w:p>
+    <w:p>
+      <w:r>
+        <w:t xml:space="preserve">3. **aelygroup.com** (« c’est la structure qui porte le produit »)  </w:t>
+      </w:r>
+    </w:p>
+    <w:p>
+      <w:r>
+        <w:t xml:space="preserve">4. **Convention + CGV** (docs 09–10)  </w:t>
+      </w:r>
+    </w:p>
+    <w:p>
+      <w:r>
+        <w:t>5. Pas de paiement avant accord / essai</w:t>
+      </w:r>
+    </w:p>
+    <w:p>
+      <w:pPr>
+        <w:pStyle w:val="Heading2"/>
+      </w:pPr>
+      <w:r>
+        <w:t>Synergie avec The Loop (guide app)</w:t>
+      </w:r>
+    </w:p>
+    <w:p>
+      <w:r>
+        <w:t xml:space="preserve">- **The Loop** = grand public / guide Conakry (projet distinct).  </w:t>
+      </w:r>
+    </w:p>
+    <w:p>
+      <w:r>
+        <w:t xml:space="preserve">- **THE LOOP Pass** = B2B commerçants.  </w:t>
+      </w:r>
+    </w:p>
+    <w:p>
+      <w:r>
+        <w:t>- **AELY** = fil conducteur « qui sommes-nous » pour les professionnels.</w:t>
+      </w:r>
+    </w:p>
+    <w:p>
+      <w:r>
+        <w:br w:type="page"/>
+      </w:r>
+    </w:p>
+    <w:p>
+      <w:pPr>
+        <w:pStyle w:val="Title"/>
+      </w:pPr>
+      <w:r>
         <w:t>01 STRATEGIE MARKETING</w:t>
       </w:r>
     </w:p>
@@ -53,7 +302,12 @@
     </w:p>
     <w:p>
       <w:r>
-        <w:t>- **Statut au lancement terrain (décembre 2026) :** projet commercial ; **société formalisée prévue en janvier 2027** (voir documents 09 et 11).</w:t>
+        <w:t>- **House brand :** **AELY** (https://aelygroup.com) — solutions numériques &amp; data, Conakry.</w:t>
+      </w:r>
+    </w:p>
+    <w:p>
+      <w:r>
+        <w:t>- **Statut au lancement terrain (décembre 2026) :** commercialisation Pass sous marque AELY ; **immatriculation formelle (RCCM / factures)** visée **janvier 2027** (voir documents 09 et 11).</w:t>
       </w:r>
     </w:p>
     <w:p>
@@ -933,7 +1187,7 @@
     </w:p>
     <w:p>
       <w:r>
-        <w:t xml:space="preserve">&gt; Je suis **[Prénom Nom]**, je développe **THE LOOP Pass** à Conakry : une **carte fidélité sur le téléphone** de vos clients (iPhone / Android), **sans application à installer pour eux**. Vous **scannez** en boutique et vous pouvez **relancer** les clients qui ne reviennent plus.  </w:t>
+        <w:t xml:space="preserve">&gt; Je suis **[Prénom Nom]**, **AELY** (aelygroup.com) — je développe **THE LOOP Pass** à Conakry : une **carte fidélité sur le téléphone** de vos clients (iPhone / Android), **sans application à installer pour eux**. Vous **scannez** en boutique et vous pouvez **relancer** les clients qui ne reviennent plus.  </w:t>
       </w:r>
     </w:p>
     <w:p>
@@ -2346,6 +2600,29 @@
         <w:pStyle w:val="Heading2"/>
       </w:pPr>
       <w:r>
+        <w:t>Pied de page / crédibilité AELY</w:t>
+      </w:r>
+    </w:p>
+    <w:p>
+      <w:r>
+        <w:t>Ajouter une ligne discrète :</w:t>
+      </w:r>
+    </w:p>
+    <w:p>
+      <w:r>
+        <w:t>*« THE LOOP Pass — un service **AELY** · [aelygroup.com](https://aelygroup.com) · Conakry »*</w:t>
+      </w:r>
+    </w:p>
+    <w:p>
+      <w:r>
+        <w:t>Cela rassure les commerçants (structure identifiable) sans mélanger avec le guide The Loop grand public.</w:t>
+      </w:r>
+    </w:p>
+    <w:p>
+      <w:pPr>
+        <w:pStyle w:val="Heading2"/>
+      </w:pPr>
+      <w:r>
         <w:t>Optionnel (phase 2)</w:t>
       </w:r>
     </w:p>
@@ -2808,12 +3085,17 @@
     </w:p>
     <w:p>
       <w:r>
-        <w:t>| Porteur de projet | |</w:t>
-      </w:r>
-    </w:p>
-    <w:p>
-      <w:r>
-        <w:t>| Raison sociale prévue | |</w:t>
+        <w:t>| Porteur de projet | [Prénom Nom] |</w:t>
+      </w:r>
+    </w:p>
+    <w:p>
+      <w:r>
+        <w:t>| Marque / groupe | **AELY** — https://aelygroup.com |</w:t>
+      </w:r>
+    </w:p>
+    <w:p>
+      <w:r>
+        <w:t>| Raison sociale / RCCM | **AELY** — immatriculation visée janv. 2027 |</w:t>
       </w:r>
     </w:p>
     <w:p>
@@ -3258,7 +3540,7 @@
     </w:p>
     <w:p>
       <w:r>
-        <w:t xml:space="preserve">[NOM PRÉNOM DU PORTEUR DE PROJET],  </w:t>
+        <w:t xml:space="preserve">[NOM PRÉNOM DU SIGNATAIRE],  </w:t>
       </w:r>
     </w:p>
     <w:p>
@@ -3268,17 +3550,22 @@
     </w:p>
     <w:p>
       <w:r>
-        <w:t xml:space="preserve">WhatsApp : +224 626 68 06 06 · E-mail : contact@theloop-app.com,  </w:t>
-      </w:r>
-    </w:p>
-    <w:p>
-      <w:r>
-        <w:t xml:space="preserve">agissant pour le compte du projet commercial **« THE LOOP Pass »**,  </w:t>
-      </w:r>
-    </w:p>
-    <w:p>
-      <w:r>
-        <w:t xml:space="preserve">en cours d’immatriculation sous la dénomination **[RAISON SOCIALE À CRÉER]**  </w:t>
+        <w:t xml:space="preserve">agissant pour le compte de la marque **AELY** (https://aelygroup.com)  </w:t>
+      </w:r>
+    </w:p>
+    <w:p>
+      <w:r>
+        <w:t xml:space="preserve">et du service **THE LOOP Pass**,  </w:t>
+      </w:r>
+    </w:p>
+    <w:p>
+      <w:r>
+        <w:t xml:space="preserve">WhatsApp : +224 626 68 06 06 · E-mail : contact@theloop-app.com · contact@aelygroup.com,  </w:t>
+      </w:r>
+    </w:p>
+    <w:p>
+      <w:r>
+        <w:t xml:space="preserve">société **AELY** en cours de finalisation d’immatriculation (RCCM / NIF — **janvier 2027**),  </w:t>
       </w:r>
     </w:p>
     <w:p>
@@ -3601,7 +3888,7 @@
     </w:p>
     <w:p>
       <w:r>
-        <w:t>La première facture couvrira la période **[mois]** 2027. Elle sera émise au nom de **[RAISON SOCIALE]** dès immatriculation effective, ou, pour les règlements intervenus avant celle-ci, selon modalité indiquée par le Prestataire (reçu / facture de transition — **à valider avec comptable**).</w:t>
+        <w:t>La première facture couvrira la période **[mois]** 2027. Elle sera émise au nom de **AELY** (ou dénomination sociale immatriculée équivalente) dès **RCCM / NIF** disponibles, ou, pour les règlements intervenus avant celle-ci, selon modalité indiquée par le Prestataire (reçu / facture de transition — **à valider avec comptable**).</w:t>
       </w:r>
     </w:p>
     <w:p>
@@ -3766,7 +4053,7 @@
     </w:p>
     <w:p>
       <w:r>
-        <w:t>À compter de l’immatriculation de **[RAISON SOCIALE]**, les droits et obligations pourront être **repris** par cette société, sans modification substantielle des conditions économiques, par **avenant** ou **notification** (modèle document n° 11).</w:t>
+        <w:t>À compter de l’immatriculation de **AELY** (ou société dédiée portant la marque), les droits et obligations pourront être **repris** par cette personne morale, sans modification substantielle des conditions économiques, par **avenant** ou **notification** (modèle document n° 11).</w:t>
       </w:r>
     </w:p>
     <w:p>
@@ -3940,22 +4227,32 @@
     </w:p>
     <w:p>
       <w:r>
-        <w:t xml:space="preserve">**Période de transition (ex. avant immatriculation) :**  </w:t>
-      </w:r>
-    </w:p>
-    <w:p>
-      <w:r>
-        <w:t>[NOM PRÉNOM], agissant pour le projet THE LOOP Pass, contact@theloop-app.com, +224 626 68 06 06.</w:t>
-      </w:r>
-    </w:p>
-    <w:p>
-      <w:r>
-        <w:t xml:space="preserve">**À compter de [date / immatriculation] :**  </w:t>
-      </w:r>
-    </w:p>
-    <w:p>
-      <w:r>
-        <w:t>[RAISON SOCIALE], [forme juridique], RCCM n° […], NIF […], siège [adresse], représentée par […].</w:t>
+        <w:t xml:space="preserve">**Période de transition (ex. avant RCCM complet — décembre 2026) :**  </w:t>
+      </w:r>
+    </w:p>
+    <w:p>
+      <w:r>
+        <w:t xml:space="preserve">[NOM PRÉNOM], agissant pour **AELY** et le service **THE LOOP Pass**,  </w:t>
+      </w:r>
+    </w:p>
+    <w:p>
+      <w:r>
+        <w:t>https://aelygroup.com · contact@aelygroup.com · contact@theloop-app.com · +224 626 68 06 06.</w:t>
+      </w:r>
+    </w:p>
+    <w:p>
+      <w:r>
+        <w:t xml:space="preserve">**À compter de l’immatriculation (visée janvier 2027) :**  </w:t>
+      </w:r>
+    </w:p>
+    <w:p>
+      <w:r>
+        <w:t xml:space="preserve">**AELY** (ou [dénomination sociale exacte]), [forme juridique], RCCM n° […], NIF […],  </w:t>
+      </w:r>
+    </w:p>
+    <w:p>
+      <w:r>
+        <w:t>siège : [adresse — ex. Dixinn, Conakry], représentée par […].</w:t>
       </w:r>
     </w:p>
     <w:p>
@@ -4362,7 +4659,12 @@
     </w:p>
     <w:p>
       <w:r>
-        <w:t>THE LOOP Pass · contact@theloop-app.com · WhatsApp +224 626 68 06 06 · https://pass.theloop-app.com</w:t>
+        <w:t xml:space="preserve">AELY · THE LOOP Pass · https://aelygroup.com · https://pass.theloop-app.com  </w:t>
+      </w:r>
+    </w:p>
+    <w:p>
+      <w:r>
+        <w:t>contact@aelygroup.com · contact@theloop-app.com · WhatsApp +224 626 68 06 06</w:t>
       </w:r>
     </w:p>
     <w:p>
@@ -4444,12 +4746,12 @@
     </w:p>
     <w:p>
       <w:r>
-        <w:t xml:space="preserve">**[RAISON SOCIALE]**, [forme], RCCM n° **[…]**, NIF **[…]**,  </w:t>
-      </w:r>
-    </w:p>
-    <w:p>
-      <w:r>
-        <w:t xml:space="preserve">siège : **[ADRESSE]**,  </w:t>
+        <w:t xml:space="preserve">**AELY** (ou **[dénomination sociale immatriculée]**), [forme], RCCM n° **[…]**, NIF **[…]**,  </w:t>
+      </w:r>
+    </w:p>
+    <w:p>
+      <w:r>
+        <w:t xml:space="preserve">siège : **[ADRESSE — ex. Dixinn, Conakry]**,  </w:t>
       </w:r>
     </w:p>
     <w:p>
@@ -4639,7 +4941,7 @@
         <w:pStyle w:val="Heading1"/>
       </w:pPr>
       <w:r>
-        <w:t>Cartes de visite — Nom de société avant immatriculation</w:t>
+        <w:t>Cartes de visite — AELY (imprimées avant RCCM janvier 2027)</w:t>
       </w:r>
     </w:p>
     <w:p>
@@ -4652,7 +4954,17 @@
     </w:p>
     <w:p>
       <w:r>
-        <w:t>Vous avez **déjà imprimé** des cartes avec le **nom de l’entreprise** que vous créerez **en janvier 2027**, et vous les utiliserez **en décembre 2026** alors que la société **n’existe pas encore** officiellement.</w:t>
+        <w:t xml:space="preserve">Vous avez imprimé des cartes avec le nom **AELY** (ou AELY Group).  </w:t>
+      </w:r>
+    </w:p>
+    <w:p>
+      <w:r>
+        <w:t xml:space="preserve">Le site **https://aelygroup.com** est **en ligne** (AELY — solutions numériques &amp; data, Conakry).  </w:t>
+      </w:r>
+    </w:p>
+    <w:p>
+      <w:r>
+        <w:t>L’**immatriculation formelle** (RCCM / NIF pour factures au nom légal) est prévue **janvier 2027**.</w:t>
       </w:r>
     </w:p>
     <w:p>
@@ -4665,37 +4977,37 @@
         <w:pStyle w:val="Heading2"/>
       </w:pPr>
       <w:r>
-        <w:t>Est-ce « très grave » ?</w:t>
-      </w:r>
-    </w:p>
-    <w:p>
-      <w:r>
-        <w:t>**En pratique, non — ce n’est en général pas très grave**, surtout si :</w:t>
-      </w:r>
-    </w:p>
-    <w:p>
-      <w:r>
-        <w:t xml:space="preserve">1. Le nom sur la carte est **celui que vous allez réellement immatriculer** (pas un nom fictif).  </w:t>
-      </w:r>
-    </w:p>
-    <w:p>
-      <w:r>
-        <w:t xml:space="preserve">2. Vous **ne mentionnez pas** de numéros **RCCM / NIF** que vous n’avez pas encore.  </w:t>
-      </w:r>
-    </w:p>
-    <w:p>
-      <w:r>
-        <w:t xml:space="preserve">3. Vous **ne facturez pas** au nom de la société avant qu’elle existe (décembre = essai / pas de facture société, ou reçu au nom de la personne — voir convention doc 09).  </w:t>
-      </w:r>
-    </w:p>
-    <w:p>
-      <w:r>
-        <w:t>4. À l’oral, vous pouvez dire : *« La société est **en cours de création** ; le service THE LOOP Pass, c’est ce que je vous montre aujourd’hui. »*</w:t>
-      </w:r>
-    </w:p>
-    <w:p>
-      <w:r>
-        <w:t>Ce n’est **pas** une arnaque si vous êtes **transparente** et que vous **honorez** vos engagements (démo, essai, création effective en janvier).</w:t>
+        <w:t>Est-ce grave d’utiliser ces cartes en décembre 2026 ?</w:t>
+      </w:r>
+    </w:p>
+    <w:p>
+      <w:r>
+        <w:t>**Non — c’est même cohérent et rassurant**, à condition de :</w:t>
+      </w:r>
+    </w:p>
+    <w:p>
+      <w:r>
+        <w:t xml:space="preserve">1. **Ne pas imprimer** de numéros **RCCM / NIF** tant qu’ils ne sont **pas** officiels.  </w:t>
+      </w:r>
+    </w:p>
+    <w:p>
+      <w:r>
+        <w:t xml:space="preserve">2. Renforcer la preuve avec **aelygroup.com** en RDV (« voici notre site groupe »).  </w:t>
+      </w:r>
+    </w:p>
+    <w:p>
+      <w:r>
+        <w:t xml:space="preserve">3. Ne pas **facturer** au nom de la société immatriculée avant **janvier 2027** sans avis comptable (essai + convention doc 09).  </w:t>
+      </w:r>
+    </w:p>
+    <w:p>
+      <w:r>
+        <w:t>4. Si besoin à l’oral : *« AELY, c’est notre structure ; l’immatriculation RCCM est finalisée en janvier ; le service que je vous montre, c’est **THE LOOP Pass**. »*</w:t>
+      </w:r>
+    </w:p>
+    <w:p>
+      <w:r>
+        <w:t>Ce n’est **pas** une arnaque : marque + site + démo + documents &gt; nom sans visibilité.</w:t>
       </w:r>
     </w:p>
     <w:p>
@@ -4708,7 +5020,7 @@
         <w:pStyle w:val="Heading2"/>
       </w:pPr>
       <w:r>
-        <w:t>Ce qui serait problématique (à éviter)</w:t>
+        <w:t>Ce qui serait problématique</w:t>
       </w:r>
     </w:p>
     <w:p>
@@ -4723,17 +5035,17 @@
     </w:p>
     <w:p>
       <w:r>
-        <w:t>| RCCM / NIF **inventés** sur la carte | Fausse représentation |</w:t>
-      </w:r>
-    </w:p>
-    <w:p>
-      <w:r>
-        <w:t>| Demander un **paiement élevé** au nom d’une société inexistante | Renforce la méfiance « arnaque » |</w:t>
-      </w:r>
-    </w:p>
-    <w:p>
-      <w:r>
-        <w:t>| Nom sur la carte **≠** futur nom légal | Contrats et factures incohérents |</w:t>
+        <w:t>| **RCCM / NIF fictifs** sur la carte | Fausse représentation |</w:t>
+      </w:r>
+    </w:p>
+    <w:p>
+      <w:r>
+        <w:t>| Paiement exigé **sans RDV** au nom « AELY » | Renforce la méfiance |</w:t>
+      </w:r>
+    </w:p>
+    <w:p>
+      <w:r>
+        <w:t>| Carte **sans** moyen de vérifier (ni site, ni tel) | Pire qu’AELY + aelygroup.com |</w:t>
       </w:r>
     </w:p>
     <w:p>
@@ -4746,67 +5058,47 @@
         <w:pStyle w:val="Heading2"/>
       </w:pPr>
       <w:r>
-        <w:t>Comment utiliser vos cartes en décembre (sans les jeter)</w:t>
-      </w:r>
-    </w:p>
-    <w:p>
-      <w:r>
-        <w:t xml:space="preserve">**Option A — Utiliser telles quelles**  </w:t>
-      </w:r>
-    </w:p>
-    <w:p>
-      <w:r>
-        <w:t xml:space="preserve">- Carte multi-projets avec **THE LOOP Pass** + **site** + **WhatsApp** + **votre prénom**.  </w:t>
-      </w:r>
-    </w:p>
-    <w:p>
-      <w:r>
-        <w:t xml:space="preserve">- Si le nom société est présent : ajouter à l’oral *« en cours d’immatriculation »*.  </w:t>
-      </w:r>
-    </w:p>
-    <w:p>
-      <w:r>
-        <w:t>- Contrats signés au **nom du porteur** + mention projet (doc 09), pas « RCCM ».</w:t>
-      </w:r>
-    </w:p>
-    <w:p>
-      <w:r>
-        <w:t xml:space="preserve">**Option B — Autocollant discret** (si vous voulez être ultra clair)  </w:t>
-      </w:r>
-    </w:p>
-    <w:p>
-      <w:r>
-        <w:t xml:space="preserve">- Petit sticker au verso : *« Société en cours d’immatriculation — janv. 2027 »*  </w:t>
-      </w:r>
-    </w:p>
-    <w:p>
-      <w:r>
-        <w:t>- Ou sticker avec **QR** vers pass.theloop-app.com</w:t>
-      </w:r>
-    </w:p>
-    <w:p>
-      <w:r>
-        <w:t xml:space="preserve">**Option C — Prochaine impression**  </w:t>
-      </w:r>
-    </w:p>
-    <w:p>
-      <w:r>
-        <w:t xml:space="preserve">- Ligne 1 : **THE LOOP Pass**  </w:t>
-      </w:r>
-    </w:p>
-    <w:p>
-      <w:r>
-        <w:t xml:space="preserve">- Ligne 2 : **[Prénom Nom]** · Fondateur / Directrice  </w:t>
-      </w:r>
-    </w:p>
-    <w:p>
-      <w:r>
-        <w:t xml:space="preserve">- Ligne 3 : pass.theloop-app.com · +224 626 68 06 06  </w:t>
-      </w:r>
-    </w:p>
-    <w:p>
-      <w:r>
-        <w:t xml:space="preserve">- Ligne 4 (option) : **[Raison sociale]** *(immatriculation en cours)*  </w:t>
+        <w:t>Modèle carte recommandé (aligné avec vos cartes actuelles)</w:t>
+      </w:r>
+    </w:p>
+    <w:p>
+      <w:r>
+        <w:t>AELY</w:t>
+      </w:r>
+    </w:p>
+    <w:p>
+      <w:r>
+        <w:t>Solutions numériques · Conakry</w:t>
+      </w:r>
+    </w:p>
+    <w:p>
+      <w:r>
+        <w:t>aelygroup.com</w:t>
+      </w:r>
+    </w:p>
+    <w:p>
+      <w:r>
+        <w:t>[Prénom Nom]</w:t>
+      </w:r>
+    </w:p>
+    <w:p>
+      <w:r>
+        <w:t>THE LOOP Pass · Fidélité commerçants</w:t>
+      </w:r>
+    </w:p>
+    <w:p>
+      <w:r>
+        <w:t>pass.theloop-app.com · +224 626 68 06 06</w:t>
+      </w:r>
+    </w:p>
+    <w:p>
+      <w:r>
+        <w:t xml:space="preserve">**Optionnel** (verso ou petite ligne) : *RCCM en cours — janv. 2027*  </w:t>
+      </w:r>
+    </w:p>
+    <w:p>
+      <w:r>
+        <w:t>**Uniquement après janvier** : ajouter RCCM / NIF sur **nouvelle** impression.</w:t>
       </w:r>
     </w:p>
     <w:p>
@@ -4819,52 +5111,32 @@
         <w:pStyle w:val="Heading2"/>
       </w:pPr>
       <w:r>
-        <w:t>Lien avec la confiance commerçants</w:t>
-      </w:r>
-    </w:p>
-    <w:p>
-      <w:r>
-        <w:t>Les commerçants guinéens se méfient surtout de :</w:t>
-      </w:r>
-    </w:p>
-    <w:p>
-      <w:r>
-        <w:t xml:space="preserve">- Paiement **avant** service ;  </w:t>
-      </w:r>
-    </w:p>
-    <w:p>
-      <w:r>
-        <w:t xml:space="preserve">- Promesses **floues** ;  </w:t>
-      </w:r>
-    </w:p>
-    <w:p>
-      <w:r>
-        <w:t>- **Aucune** présence physique.</w:t>
-      </w:r>
-    </w:p>
-    <w:p>
-      <w:r>
-        <w:t>Votre carte avec un **nom futur** est **secondaire** si vous :</w:t>
-      </w:r>
-    </w:p>
-    <w:p>
-      <w:r>
-        <w:t xml:space="preserve">- Faites la **démo chez eux** ;  </w:t>
-      </w:r>
-    </w:p>
-    <w:p>
-      <w:r>
-        <w:t xml:space="preserve">- Proposez **essai 14 j** ;  </w:t>
-      </w:r>
-    </w:p>
-    <w:p>
-      <w:r>
-        <w:t xml:space="preserve">- Montrez le **site** et un **document** signé (convention) ;  </w:t>
-      </w:r>
-    </w:p>
-    <w:p>
-      <w:r>
-        <w:t>- **Reportez facturation société** à janvier.</w:t>
+        <w:t>En RDV décembre — ordre de confiance</w:t>
+      </w:r>
+    </w:p>
+    <w:p>
+      <w:r>
+        <w:t xml:space="preserve">1. Démo **THE LOOP Pass** sur leur téléphone  </w:t>
+      </w:r>
+    </w:p>
+    <w:p>
+      <w:r>
+        <w:t xml:space="preserve">2. **pass.theloop-app.com**  </w:t>
+      </w:r>
+    </w:p>
+    <w:p>
+      <w:r>
+        <w:t xml:space="preserve">3. **aelygroup.com** (crédibilité structure)  </w:t>
+      </w:r>
+    </w:p>
+    <w:p>
+      <w:r>
+        <w:t xml:space="preserve">4. Convention + CGV (docs 09–10)  </w:t>
+      </w:r>
+    </w:p>
+    <w:p>
+      <w:r>
+        <w:t xml:space="preserve">5. Essai 14 j · pas de paiement immédiat si prospect froid  </w:t>
       </w:r>
     </w:p>
     <w:p>
@@ -4877,55 +5149,17 @@
         <w:pStyle w:val="Heading2"/>
       </w:pPr>
       <w:r>
-        <w:t>Checklist avant RDV décembre</w:t>
-      </w:r>
-    </w:p>
-    <w:p>
-      <w:r>
-        <w:t xml:space="preserve">- [ ] Carte : pas de faux RCCM  </w:t>
-      </w:r>
-    </w:p>
-    <w:p>
-      <w:r>
-        <w:t xml:space="preserve">- [ ] Convention + CGV (PDF ou papier)  </w:t>
-      </w:r>
-    </w:p>
-    <w:p>
-      <w:r>
-        <w:t xml:space="preserve">- [ ] Phrase oral « société en cours de création » prête  </w:t>
-      </w:r>
-    </w:p>
-    <w:p>
-      <w:r>
-        <w:t xml:space="preserve">- [ ] WhatsApp pro identifiable (photo, nom)  </w:t>
-      </w:r>
-    </w:p>
-    <w:p>
-      <w:r>
-        <w:t>- [ ] Site à jour (recommandations doc 06)</w:t>
-      </w:r>
-    </w:p>
-    <w:p>
-      <w:r>
-        <w:t>---</w:t>
-      </w:r>
-    </w:p>
-    <w:p>
-      <w:pPr>
-        <w:pStyle w:val="Heading2"/>
-      </w:pPr>
-      <w:r>
         <w:t>Conclusion</w:t>
       </w:r>
     </w:p>
     <w:p>
       <w:r>
-        <w:t xml:space="preserve">**Imprimer le nom de la future société n’est pas une bêtise grave** : c’est courant en phase de lancement. Soyez **transparente**, **ne facturez pas** au nom de la société avant janvier sans avis comptable, et **alignez** les contrats (doc 09 + 11).  </w:t>
-      </w:r>
-    </w:p>
-    <w:p>
-      <w:r>
-        <w:t>Pour la prochaine batch de cartes, privilégiez **THE LOOP Pass + votre nom + contacts** ; la raison sociale peut apparaître avec *« en cours d’immatriculation »* si vous le souhaitez.</w:t>
+        <w:t xml:space="preserve">Mettre **AELY** sur la carte **n’était pas une bêtise** : ça correspond au site **aelygroup.com**.  </w:t>
+      </w:r>
+    </w:p>
+    <w:p>
+      <w:r>
+        <w:t>Le seul point de vigilance : **RCCM/NIF et factures** au nom légal à partir de **janvier 2027** (avenant doc 11).</w:t>
       </w:r>
     </w:p>
     <w:sectPr>

</xml_diff>